<commit_message>
docs: actualiza notebook e informe de Sumativa 1
</commit_message>
<xml_diff>
--- a/S1/informe_sumativa1_grupo2.docx
+++ b/S1/informe_sumativa1_grupo2.docx
@@ -1203,12 +1203,11 @@
           <w:b/>
         </w:rPr>
       </w:pPr>
-      <w:proofErr w:type="spellStart"/>
       <w:r>
         <w:rPr>
           <w:b/>
           <w:bCs/>
-          <w:lang w:val="en-US"/>
+          <w:lang w:val="es-CL"/>
         </w:rPr>
         <w:t>I</w:t>
       </w:r>
@@ -1216,7 +1215,7 @@
         <w:rPr>
           <w:b/>
           <w:bCs/>
-          <w:lang w:val="en-US"/>
+          <w:lang w:val="es-CL"/>
         </w:rPr>
         <w:t>ntegrante</w:t>
       </w:r>
@@ -1224,16 +1223,15 @@
         <w:rPr>
           <w:b/>
           <w:bCs/>
-          <w:lang w:val="en-US"/>
+          <w:lang w:val="es-CL"/>
         </w:rPr>
         <w:t>s</w:t>
       </w:r>
-      <w:proofErr w:type="spellEnd"/>
       <w:r>
         <w:rPr>
           <w:b/>
           <w:bCs/>
-          <w:lang w:val="en-US"/>
+          <w:lang w:val="es-CL"/>
         </w:rPr>
         <w:t>:</w:t>
       </w:r>
@@ -1470,7 +1468,15 @@
           <w:color w:val="231F20"/>
           <w:spacing w:val="-2"/>
         </w:rPr>
-        <w:t>12</w:t>
+        <w:t>1</w:t>
+      </w:r>
+      <w:r>
+        <w:rPr>
+          <w:bCs/>
+          <w:color w:val="231F20"/>
+          <w:spacing w:val="-2"/>
+        </w:rPr>
+        <w:t>4</w:t>
       </w:r>
       <w:r>
         <w:rPr>
@@ -2397,21 +2403,7 @@
         <w:rPr>
           <w:sz w:val="21"/>
         </w:rPr>
-        <w:t xml:space="preserve">El </w:t>
-      </w:r>
-      <w:proofErr w:type="spellStart"/>
-      <w:r>
-        <w:rPr>
-          <w:sz w:val="21"/>
-        </w:rPr>
-        <w:t>dataset</w:t>
-      </w:r>
-      <w:proofErr w:type="spellEnd"/>
-      <w:r>
-        <w:rPr>
-          <w:sz w:val="21"/>
-        </w:rPr>
-        <w:t xml:space="preserve"> </w:t>
+        <w:t xml:space="preserve">El dataset </w:t>
       </w:r>
       <w:r>
         <w:rPr>
@@ -2496,10 +2488,16 @@
       </w:r>
       <w:r>
         <w:rPr>
+          <w:sz w:val="21"/>
+        </w:rPr>
+        <w:t>S1</w:t>
+      </w:r>
+      <w:r>
+        <w:rPr>
           <w:rFonts w:ascii="Consolas" w:hAnsi="Consolas"/>
           <w:sz w:val="19"/>
         </w:rPr>
-        <w:t>F2/</w:t>
+        <w:t>/</w:t>
       </w:r>
       <w:r>
         <w:rPr>
@@ -3066,21 +3064,7 @@
               <w:rPr>
                 <w:sz w:val="17"/>
               </w:rPr>
-              <w:t>Sin valores negativos; tasas en [</w:t>
-            </w:r>
-            <w:proofErr w:type="gramStart"/>
-            <w:r>
-              <w:rPr>
-                <w:sz w:val="17"/>
-              </w:rPr>
-              <w:t>0 ;</w:t>
-            </w:r>
-            <w:proofErr w:type="gramEnd"/>
-            <w:r>
-              <w:rPr>
-                <w:sz w:val="17"/>
-              </w:rPr>
-              <w:t xml:space="preserve"> 0,2]</w:t>
+              <w:t>Sin valores negativos; tasas en [0 ; 0,2]</w:t>
             </w:r>
           </w:p>
         </w:tc>
@@ -3385,21 +3369,7 @@
         <w:rPr>
           <w:sz w:val="21"/>
         </w:rPr>
-        <w:t xml:space="preserve">Las 125 filas con valores idénticos (1,01 %) se conservaron, dado que la documentación original del </w:t>
-      </w:r>
-      <w:proofErr w:type="spellStart"/>
-      <w:r>
-        <w:rPr>
-          <w:sz w:val="21"/>
-        </w:rPr>
-        <w:t>dataset</w:t>
-      </w:r>
-      <w:proofErr w:type="spellEnd"/>
-      <w:r>
-        <w:rPr>
-          <w:sz w:val="21"/>
-        </w:rPr>
-        <w:t xml:space="preserve"> (Sakar &amp; </w:t>
+        <w:t xml:space="preserve">Las 125 filas con valores idénticos (1,01 %) se conservaron, dado que la documentación original del dataset (Sakar &amp; </w:t>
       </w:r>
       <w:proofErr w:type="spellStart"/>
       <w:r>
@@ -6318,35 +6288,7 @@
         <w:rPr>
           <w:sz w:val="21"/>
         </w:rPr>
-        <w:t xml:space="preserve">: x̄ ± </w:t>
-      </w:r>
-      <w:proofErr w:type="gramStart"/>
-      <w:r>
-        <w:rPr>
-          <w:sz w:val="21"/>
-        </w:rPr>
-        <w:t>t(</w:t>
-      </w:r>
-      <w:proofErr w:type="gramEnd"/>
-      <w:r>
-        <w:rPr>
-          <w:sz w:val="21"/>
-        </w:rPr>
-        <w:t>0,975; n−</w:t>
-      </w:r>
-      <w:proofErr w:type="gramStart"/>
-      <w:r>
-        <w:rPr>
-          <w:sz w:val="21"/>
-        </w:rPr>
-        <w:t>1)·</w:t>
-      </w:r>
-      <w:proofErr w:type="gramEnd"/>
-      <w:r>
-        <w:rPr>
-          <w:sz w:val="21"/>
-        </w:rPr>
-        <w:t>s/√n.</w:t>
+        <w:t>: x̄ ± t(0,975; n−1)·s/√n.</w:t>
       </w:r>
     </w:p>
     <w:p>
@@ -6723,58 +6665,30 @@
               <w:rPr>
                 <w:sz w:val="17"/>
               </w:rPr>
-              <w:t>[1.160,</w:t>
-            </w:r>
-            <w:proofErr w:type="gramStart"/>
+              <w:t>[1.160,96 ; 1.228,53]</w:t>
+            </w:r>
+          </w:p>
+        </w:tc>
+        <w:tc>
+          <w:tcPr>
+            <w:tcW w:w="2154" w:type="dxa"/>
+            <w:tcBorders>
+              <w:top w:val="single" w:sz="4" w:space="0" w:color="000000"/>
+              <w:left w:val="nil"/>
+              <w:bottom w:val="nil"/>
+              <w:right w:val="nil"/>
+            </w:tcBorders>
+          </w:tcPr>
+          <w:p>
+            <w:pPr>
+              <w:keepNext/>
+              <w:jc w:val="both"/>
+            </w:pPr>
             <w:r>
               <w:rPr>
                 <w:sz w:val="17"/>
               </w:rPr>
-              <w:t>96 ;</w:t>
-            </w:r>
-            <w:proofErr w:type="gramEnd"/>
-            <w:r>
-              <w:rPr>
-                <w:sz w:val="17"/>
-              </w:rPr>
-              <w:t xml:space="preserve"> 1.228,53]</w:t>
-            </w:r>
-          </w:p>
-        </w:tc>
-        <w:tc>
-          <w:tcPr>
-            <w:tcW w:w="2154" w:type="dxa"/>
-            <w:tcBorders>
-              <w:top w:val="single" w:sz="4" w:space="0" w:color="000000"/>
-              <w:left w:val="nil"/>
-              <w:bottom w:val="nil"/>
-              <w:right w:val="nil"/>
-            </w:tcBorders>
-          </w:tcPr>
-          <w:p>
-            <w:pPr>
-              <w:keepNext/>
-              <w:jc w:val="both"/>
-            </w:pPr>
-            <w:r>
-              <w:rPr>
-                <w:sz w:val="17"/>
-              </w:rPr>
-              <w:t>[1.161,</w:t>
-            </w:r>
-            <w:proofErr w:type="gramStart"/>
-            <w:r>
-              <w:rPr>
-                <w:sz w:val="17"/>
-              </w:rPr>
-              <w:t>09 ;</w:t>
-            </w:r>
-            <w:proofErr w:type="gramEnd"/>
-            <w:r>
-              <w:rPr>
-                <w:sz w:val="17"/>
-              </w:rPr>
-              <w:t xml:space="preserve"> 1.229,04]</w:t>
+              <w:t>[1.161,09 ; 1.229,04]</w:t>
             </w:r>
           </w:p>
         </w:tc>
@@ -6874,58 +6788,30 @@
               <w:rPr>
                 <w:sz w:val="17"/>
               </w:rPr>
-              <w:t>[</w:t>
-            </w:r>
-            <w:proofErr w:type="gramStart"/>
+              <w:t>[5,561 ; 6,217]</w:t>
+            </w:r>
+          </w:p>
+        </w:tc>
+        <w:tc>
+          <w:tcPr>
+            <w:tcW w:w="2154" w:type="dxa"/>
+            <w:tcBorders>
+              <w:top w:val="nil"/>
+              <w:left w:val="nil"/>
+              <w:bottom w:val="nil"/>
+              <w:right w:val="nil"/>
+            </w:tcBorders>
+          </w:tcPr>
+          <w:p>
+            <w:pPr>
+              <w:keepNext/>
+              <w:jc w:val="both"/>
+            </w:pPr>
             <w:r>
               <w:rPr>
                 <w:sz w:val="17"/>
               </w:rPr>
-              <w:t>5,561 ;</w:t>
-            </w:r>
-            <w:proofErr w:type="gramEnd"/>
-            <w:r>
-              <w:rPr>
-                <w:sz w:val="17"/>
-              </w:rPr>
-              <w:t xml:space="preserve"> 6,217]</w:t>
-            </w:r>
-          </w:p>
-        </w:tc>
-        <w:tc>
-          <w:tcPr>
-            <w:tcW w:w="2154" w:type="dxa"/>
-            <w:tcBorders>
-              <w:top w:val="nil"/>
-              <w:left w:val="nil"/>
-              <w:bottom w:val="nil"/>
-              <w:right w:val="nil"/>
-            </w:tcBorders>
-          </w:tcPr>
-          <w:p>
-            <w:pPr>
-              <w:keepNext/>
-              <w:jc w:val="both"/>
-            </w:pPr>
-            <w:r>
-              <w:rPr>
-                <w:sz w:val="17"/>
-              </w:rPr>
-              <w:t>[</w:t>
-            </w:r>
-            <w:proofErr w:type="gramStart"/>
-            <w:r>
-              <w:rPr>
-                <w:sz w:val="17"/>
-              </w:rPr>
-              <w:t>5,572 ;</w:t>
-            </w:r>
-            <w:proofErr w:type="gramEnd"/>
-            <w:r>
-              <w:rPr>
-                <w:sz w:val="17"/>
-              </w:rPr>
-              <w:t xml:space="preserve"> 6,223]</w:t>
+              <w:t>[5,572 ; 6,223]</w:t>
             </w:r>
           </w:p>
         </w:tc>
@@ -7021,57 +6907,29 @@
               <w:rPr>
                 <w:sz w:val="17"/>
               </w:rPr>
-              <w:t>[0,</w:t>
-            </w:r>
-            <w:proofErr w:type="gramStart"/>
+              <w:t>[0,0422 ; 0,0439]</w:t>
+            </w:r>
+          </w:p>
+        </w:tc>
+        <w:tc>
+          <w:tcPr>
+            <w:tcW w:w="2154" w:type="dxa"/>
+            <w:tcBorders>
+              <w:top w:val="nil"/>
+              <w:left w:val="nil"/>
+              <w:bottom w:val="single" w:sz="8" w:space="0" w:color="000000"/>
+              <w:right w:val="nil"/>
+            </w:tcBorders>
+          </w:tcPr>
+          <w:p>
+            <w:pPr>
+              <w:jc w:val="both"/>
+            </w:pPr>
             <w:r>
               <w:rPr>
                 <w:sz w:val="17"/>
               </w:rPr>
-              <w:t>0422 ;</w:t>
-            </w:r>
-            <w:proofErr w:type="gramEnd"/>
-            <w:r>
-              <w:rPr>
-                <w:sz w:val="17"/>
-              </w:rPr>
-              <w:t xml:space="preserve"> 0,0439]</w:t>
-            </w:r>
-          </w:p>
-        </w:tc>
-        <w:tc>
-          <w:tcPr>
-            <w:tcW w:w="2154" w:type="dxa"/>
-            <w:tcBorders>
-              <w:top w:val="nil"/>
-              <w:left w:val="nil"/>
-              <w:bottom w:val="single" w:sz="8" w:space="0" w:color="000000"/>
-              <w:right w:val="nil"/>
-            </w:tcBorders>
-          </w:tcPr>
-          <w:p>
-            <w:pPr>
-              <w:jc w:val="both"/>
-            </w:pPr>
-            <w:r>
-              <w:rPr>
-                <w:sz w:val="17"/>
-              </w:rPr>
-              <w:t>[0,</w:t>
-            </w:r>
-            <w:proofErr w:type="gramStart"/>
-            <w:r>
-              <w:rPr>
-                <w:sz w:val="17"/>
-              </w:rPr>
-              <w:t>0422 ;</w:t>
-            </w:r>
-            <w:proofErr w:type="gramEnd"/>
-            <w:r>
-              <w:rPr>
-                <w:sz w:val="17"/>
-              </w:rPr>
-              <w:t xml:space="preserve"> 0,0440]</w:t>
+              <w:t>[0,0422 ; 0,0440]</w:t>
             </w:r>
           </w:p>
         </w:tc>
@@ -7230,21 +7088,7 @@
         <w:rPr>
           <w:sz w:val="21"/>
         </w:rPr>
-        <w:t xml:space="preserve"> se estimó en p̂ = 15,47%, con IC 95% (aproximación normal) de [14,84</w:t>
-      </w:r>
-      <w:proofErr w:type="gramStart"/>
-      <w:r>
-        <w:rPr>
-          <w:sz w:val="21"/>
-        </w:rPr>
-        <w:t>% ;</w:t>
-      </w:r>
-      <w:proofErr w:type="gramEnd"/>
-      <w:r>
-        <w:rPr>
-          <w:sz w:val="21"/>
-        </w:rPr>
-        <w:t xml:space="preserve"> 16,11%]; las condiciones </w:t>
+        <w:t xml:space="preserve"> se estimó en p̂ = 15,47%, con IC 95% (aproximación normal) de [14,84% ; 16,11%]; las condiciones </w:t>
       </w:r>
       <w:proofErr w:type="spellStart"/>
       <w:r>
@@ -8587,7 +8431,14 @@
           <w:rFonts w:ascii="Consolas" w:hAnsi="Consolas"/>
           <w:sz w:val="19"/>
         </w:rPr>
-        <w:t>F2/01_exploracion_inicial.ipynb</w:t>
+        <w:t xml:space="preserve"> S1</w:t>
+      </w:r>
+      <w:r>
+        <w:rPr>
+          <w:rFonts w:ascii="Consolas" w:hAnsi="Consolas"/>
+          <w:sz w:val="19"/>
+        </w:rPr>
+        <w:t>/01_exploracion_inicial.ipynb</w:t>
       </w:r>
       <w:r>
         <w:rPr>

</xml_diff>